<commit_message>
Add missing Solar2D files
</commit_message>
<xml_diff>
--- a/Solar2D/API TTLock per Solar2D.docx
+++ b/Solar2D/API TTLock per Solar2D.docx
@@ -60,6 +60,20 @@
     </w:p>
     <w:p>
       <w:pPr>
+        <w:pStyle w:val="Heading3"/>
+        <w:rPr>
+          <w:lang w:val="it-IT"/>
+        </w:rPr>
+      </w:pPr>
+      <w:r>
+        <w:rPr>
+          <w:lang w:val="it-IT"/>
+        </w:rPr>
+        <w:t>1.1 Installare il plugin principale</w:t>
+      </w:r>
+    </w:p>
+    <w:p>
+      <w:pPr>
         <w:pStyle w:val="NormalWeb"/>
         <w:rPr>
           <w:lang w:val="it-IT"/>
@@ -69,46 +83,155 @@
         <w:rPr>
           <w:lang w:val="it-IT"/>
         </w:rPr>
-        <w:t>Individua i file del plugin nella cartella:</w:t>
+        <w:t>Individua l’archivio del plugin:</w:t>
       </w:r>
     </w:p>
     <w:p>
       <w:pPr>
         <w:pStyle w:val="NormalWeb"/>
-      </w:pPr>
-      <w:r>
-        <w:rPr>
-          <w:rStyle w:val="HTMLCode"/>
-        </w:rPr>
-        <w:t>D:/sw/ttlock/it.shannonit</w:t>
-      </w:r>
-      <w:r>
-        <w:rPr>
-          <w:rStyle w:val="HTMLCode"/>
-        </w:rPr>
-        <w:t>.</w:t>
-      </w:r>
-      <w:r>
-        <w:rPr>
-          <w:rStyle w:val="HTMLCode"/>
-        </w:rPr>
-        <w:t>zip</w:t>
+        <w:rPr>
+          <w:lang w:val="it-IT"/>
+        </w:rPr>
+      </w:pPr>
+      <w:r>
+        <w:rPr>
+          <w:rStyle w:val="HTMLCode"/>
+          <w:lang w:val="it-IT"/>
+        </w:rPr>
+        <w:t>D:/sw/ttlock/it.shannonit.zip</w:t>
+      </w:r>
+    </w:p>
+    <w:p>
+      <w:pPr>
+        <w:pStyle w:val="NormalWeb"/>
+        <w:rPr>
+          <w:lang w:val="it-IT"/>
+        </w:rPr>
+      </w:pPr>
+      <w:r>
+        <w:rPr>
+          <w:lang w:val="it-IT"/>
+        </w:rPr>
+        <w:t>Estrai i file nella directory dei plugin di Solar2D, generalmente:</w:t>
+      </w:r>
+    </w:p>
+    <w:p>
+      <w:pPr>
+        <w:pStyle w:val="NormalWeb"/>
+      </w:pPr>
+      <w:r>
+        <w:rPr>
+          <w:rStyle w:val="HTMLCode"/>
+        </w:rPr>
+        <w:t>C:\Users\&lt;NomeUtente&gt;\AppData\Roaming\Solar2DPlugins</w:t>
+      </w:r>
+    </w:p>
+    <w:p>
+      <w:pPr>
+        <w:pStyle w:val="NormalWeb"/>
+        <w:rPr>
+          <w:lang w:val="it-IT"/>
+        </w:rPr>
+      </w:pPr>
+      <w:r>
+        <w:rPr>
+          <w:lang w:val="it-IT"/>
+        </w:rPr>
+        <w:t>Ad esempio:</w:t>
+      </w:r>
+    </w:p>
+    <w:p>
+      <w:pPr>
+        <w:pStyle w:val="NormalWeb"/>
+        <w:rPr>
+          <w:lang w:val="it-IT"/>
+        </w:rPr>
+      </w:pPr>
+      <w:r>
+        <w:rPr>
+          <w:rStyle w:val="HTMLCode"/>
+          <w:lang w:val="it-IT"/>
+        </w:rPr>
+        <w:t>C:\Users\simeo\AppData\Roaming\Solar2DPlugins</w:t>
+      </w:r>
+    </w:p>
+    <w:p>
+      <w:pPr>
+        <w:pStyle w:val="Heading3"/>
+        <w:rPr>
+          <w:lang w:val="it-IT"/>
+        </w:rPr>
+      </w:pPr>
+      <w:r>
+        <w:rPr>
+          <w:lang w:val="it-IT"/>
+        </w:rPr>
+        <w:t>1.2 Installare i file di supporto per il simulatore</w:t>
+      </w:r>
+    </w:p>
+    <w:p>
+      <w:pPr>
+        <w:pStyle w:val="NormalWeb"/>
+        <w:rPr>
+          <w:lang w:val="it-IT"/>
+        </w:rPr>
+      </w:pPr>
+      <w:r>
+        <w:rPr>
+          <w:lang w:val="it-IT"/>
+        </w:rPr>
+        <w:t>Individua l’archivio contenente i file di supporto per il simulatore:</w:t>
+      </w:r>
+    </w:p>
+    <w:p>
+      <w:pPr>
+        <w:pStyle w:val="NormalWeb"/>
+        <w:rPr>
+          <w:lang w:val="it-IT"/>
+        </w:rPr>
+      </w:pPr>
+      <w:r>
+        <w:rPr>
+          <w:rStyle w:val="HTMLCode"/>
+          <w:lang w:val="it-IT"/>
+        </w:rPr>
+        <w:t>D:/sw/ttlock/plugin</w:t>
       </w:r>
       <w:bookmarkStart w:id="0" w:name="_GoBack"/>
       <w:bookmarkEnd w:id="0"/>
+      <w:r>
+        <w:rPr>
+          <w:rStyle w:val="HTMLCode"/>
+          <w:lang w:val="it-IT"/>
+        </w:rPr>
+        <w:t>.zip</w:t>
+      </w:r>
     </w:p>
     <w:p>
       <w:pPr>
         <w:pStyle w:val="NormalWeb"/>
-        <w:rPr>
-          <w:lang w:val="it-IT"/>
-        </w:rPr>
-      </w:pPr>
-      <w:r>
-        <w:rPr>
-          <w:lang w:val="it-IT"/>
-        </w:rPr>
-        <w:t>Estrai i file nella directory dei plugin di Solar2D, generalmente:</w:t>
+      </w:pPr>
+      <w:r>
+        <w:rPr>
+          <w:lang w:val="it-IT"/>
+        </w:rPr>
+        <w:t xml:space="preserve">Estrai il contenuto nella cartella dei plugin del simulatore di Solar2D. </w:t>
+      </w:r>
+      <w:proofErr w:type="spellStart"/>
+      <w:r>
+        <w:t>Ad</w:t>
+      </w:r>
+      <w:proofErr w:type="spellEnd"/>
+      <w:r>
+        <w:t xml:space="preserve"> </w:t>
+      </w:r>
+      <w:proofErr w:type="spellStart"/>
+      <w:r>
+        <w:t>esempio</w:t>
+      </w:r>
+      <w:proofErr w:type="spellEnd"/>
+      <w:r>
+        <w:t>:</w:t>
       </w:r>
     </w:p>
     <w:p>
@@ -119,7 +242,19 @@
         <w:rPr>
           <w:rStyle w:val="HTMLCode"/>
         </w:rPr>
-        <w:t>C:\Users\&lt;NomeUtente&gt;\AppData\Roaming\Solar2DPlugins</w:t>
+        <w:t>C:\Users\</w:t>
+      </w:r>
+      <w:r>
+        <w:rPr>
+          <w:rStyle w:val="HTMLCode"/>
+        </w:rPr>
+        <w:t>&lt;NomeUtente&gt;</w:t>
+      </w:r>
+      <w:r>
+        <w:rPr>
+          <w:rStyle w:val="HTMLCode"/>
+        </w:rPr>
+        <w:t>\AppData\Roaming\Corona Labs\Corona Simulator\Plugins\plugin</w:t>
       </w:r>
     </w:p>
     <w:p>
@@ -133,22 +268,74 @@
         <w:rPr>
           <w:lang w:val="it-IT"/>
         </w:rPr>
-        <w:t>Ad esempio:</w:t>
+        <w:t xml:space="preserve">Verifica che il file </w:t>
+      </w:r>
+      <w:r>
+        <w:rPr>
+          <w:rStyle w:val="HTMLCode"/>
+          <w:lang w:val="it-IT"/>
+        </w:rPr>
+        <w:t>ttlock.lua</w:t>
+      </w:r>
+      <w:r>
+        <w:rPr>
+          <w:lang w:val="it-IT"/>
+        </w:rPr>
+        <w:t xml:space="preserve"> si trovi nel percorso previsto dal plugin, ad esempio:</w:t>
       </w:r>
     </w:p>
     <w:p>
       <w:pPr>
         <w:pStyle w:val="NormalWeb"/>
-        <w:rPr>
-          <w:lang w:val="it-IT"/>
-        </w:rPr>
-      </w:pPr>
-      <w:r>
-        <w:rPr>
-          <w:rStyle w:val="HTMLCode"/>
-          <w:lang w:val="it-IT"/>
-        </w:rPr>
-        <w:t>C:\Users\simeo\AppData\Roaming\Solar2DPlugins</w:t>
+      </w:pPr>
+      <w:r>
+        <w:rPr>
+          <w:rStyle w:val="HTMLCode"/>
+        </w:rPr>
+        <w:t>C:\Users\simeo\AppData\Roaming\Corona Labs\Corona Simulator\Plugins\plugin\</w:t>
+      </w:r>
+      <w:proofErr w:type="spellStart"/>
+      <w:r>
+        <w:rPr>
+          <w:rStyle w:val="HTMLCode"/>
+        </w:rPr>
+        <w:t>ttlock.lua</w:t>
+      </w:r>
+      <w:proofErr w:type="spellEnd"/>
+    </w:p>
+    <w:p>
+      <w:pPr>
+        <w:pStyle w:val="NormalWeb"/>
+        <w:rPr>
+          <w:lang w:val="it-IT"/>
+        </w:rPr>
+      </w:pPr>
+      <w:r>
+        <w:rPr>
+          <w:rStyle w:val="Strong"/>
+          <w:lang w:val="it-IT"/>
+        </w:rPr>
+        <w:t>Nota importante:</w:t>
+      </w:r>
+      <w:r>
+        <w:rPr>
+          <w:lang w:val="it-IT"/>
+        </w:rPr>
+        <w:t xml:space="preserve"> I file di supporto consentono di testare l’app nel simulatore. I test BLE reali richiedono un dispositivo compatibile. In caso di errori nel simulatore, aggiungi le opportune eccezioni o implementa uno stub nel file richiesto.</w:t>
+      </w:r>
+    </w:p>
+    <w:p>
+      <w:pPr>
+        <w:pStyle w:val="NormalWeb"/>
+        <w:rPr>
+          <w:lang w:val="it-IT"/>
+        </w:rPr>
+      </w:pPr>
+      <w:r>
+        <w:rPr>
+          <w:lang w:val="it-IT"/>
+        </w:rPr>
+        <w:t>Dopo l’installazione, riavvia Solar2D e verifica che il plugin venga caricato correttamente.</w:t>
       </w:r>
     </w:p>
     <w:p>
@@ -176,6 +363,7 @@
         <w:rPr>
           <w:lang w:val="it-IT"/>
         </w:rPr>
+        <w:lastRenderedPageBreak/>
         <w:t xml:space="preserve">Aggiorna il file </w:t>
       </w:r>
       <w:r>
@@ -765,7 +953,6 @@
         <w:rPr>
           <w:lang w:val="it-IT"/>
         </w:rPr>
-        <w:lastRenderedPageBreak/>
         <w:t>3. Consultazione degli esempi</w:t>
       </w:r>
     </w:p>
@@ -999,6 +1186,7 @@
       </w:pPr>
       <w:proofErr w:type="spellStart"/>
       <w:r>
+        <w:lastRenderedPageBreak/>
         <w:t>Flusso</w:t>
       </w:r>
       <w:proofErr w:type="spellEnd"/>

</xml_diff>